<commit_message>
Update version baseline to 2.4.9 in project docs
- HiDPI PAC indicator fix: removed dark box-shadow overlay and semi-transparent borders, boosted vivid signal colors, slightly wider bars
- Updated ADSI_Dashboard_Presentation.pptx with v2.4.8 feature set and Solcast free Toolkit explanation
- Updated ADSI-Dashboard-Pricing-Summary.docx with expanded features and adjusted pricing
- Version baseline bump to 2.4.9

Co-Authored-By: Claude Opus 4.6 <noreply@anthropic.com>
</commit_message>
<xml_diff>
--- a/docs/ADSI-Dashboard-Pricing-Summary.docx
+++ b/docs/ADSI-Dashboard-Pricing-Summary.docx
@@ -31,8 +31,8 @@
           <w:b/>
           <w:bCs/>
           <w:color w:val="1B3A6B"/>
-          <w:sz w:val="44"/>
-          <w:szCs w:val="44"/>
+          <w:sz w:val="40"/>
+          <w:szCs w:val="40"/>
         </w:rPr>
       </w:pPr>
       <w:r>
@@ -40,10 +40,20 @@
           <w:b/>
           <w:bCs/>
           <w:color w:val="1B3A6B"/>
-          <w:sz w:val="44"/>
-          <w:szCs w:val="44"/>
+          <w:sz w:val="40"/>
+          <w:szCs w:val="40"/>
         </w:rPr>
         <w:t>SCADA-Based Monitoring and Control</w:t>
+      </w:r>
+      <w:r>
+        <w:rPr>
+          <w:b/>
+          <w:bCs/>
+          <w:color w:val="1B3A6B"/>
+          <w:sz w:val="40"/>
+          <w:szCs w:val="40"/>
+        </w:rPr>
+        <w:t xml:space="preserve"> Platform  </w:t>
       </w:r>
     </w:p>
     <w:p>
@@ -77,43 +87,29 @@
     <w:p>
       <w:pPr>
         <w:rPr>
-          <w:color w:val="000000" w:themeColor="text1"/>
+          <w:color w:val="auto"/>
+          <w:sz w:val="24"/>
+          <w:szCs w:val="24"/>
         </w:rPr>
       </w:pPr>
       <w:r>
         <w:rPr>
           <w:i/>
           <w:iCs/>
-          <w:color w:val="000000" w:themeColor="text1"/>
-          <w:sz w:val="19"/>
-          <w:szCs w:val="19"/>
+          <w:color w:val="auto"/>
+          <w:sz w:val="22"/>
+          <w:szCs w:val="22"/>
         </w:rPr>
-        <w:t>This pricing reflects a per-site commercial model for a</w:t>
-      </w:r>
-      <w:r>
-        <w:rPr>
-          <w:i/>
-          <w:iCs/>
-          <w:color w:val="000000" w:themeColor="text1"/>
-          <w:sz w:val="19"/>
-          <w:szCs w:val="19"/>
-        </w:rPr>
-        <w:t xml:space="preserve">n </w:t>
-      </w:r>
-      <w:r>
-        <w:rPr>
-          <w:i/>
-          <w:iCs/>
-          <w:color w:val="000000" w:themeColor="text1"/>
-          <w:sz w:val="19"/>
-          <w:szCs w:val="19"/>
-        </w:rPr>
-        <w:t>industrial solar plant, covering plant-wide monitoring, inverter fast control, analytics, alarms, audit trail, forecasting, export functions, topology synchronization, updates, and backup.</w:t>
+        <w:t>This pricing reflects a per-site commercial model for an industrial solar plant, covering plant-wide monitoring, inverter fast control, plant output auto capping, analytics, alarms, audit trail, day-ahead ML forecasting, Solcast toolkit integration (no paid subscription required), export functions, gateway-remote synchronization, cloud backup, operator messaging, updates, and in-app user guide.</w:t>
       </w:r>
     </w:p>
     <w:p>
       <w:pPr>
-        <w:spacing w:before="300"/>
+        <w:rPr>
+          <w:color w:val="000000" w:themeColor="text1"/>
+          <w:sz w:val="24"/>
+          <w:szCs w:val="24"/>
+        </w:rPr>
       </w:pPr>
     </w:p>
     <w:p>
@@ -142,6 +138,10 @@
           <w:bottom w:val="single" w:sz="8" w:space="1" w:color="2563AB"/>
         </w:pBdr>
         <w:spacing w:before="60" w:after="200"/>
+        <w:rPr>
+          <w:sz w:val="2"/>
+          <w:szCs w:val="2"/>
+        </w:rPr>
       </w:pPr>
     </w:p>
     <w:tbl>
@@ -260,7 +260,7 @@
       </w:tr>
       <w:tr>
         <w:trPr>
-          <w:trHeight w:val="1080"/>
+          <w:trHeight w:val="1123"/>
         </w:trPr>
         <w:tc>
           <w:tcPr>
@@ -283,14 +283,16 @@
           <w:p>
             <w:pPr>
               <w:rPr>
-                <w:color w:val="000000" w:themeColor="text1"/>
+                <w:b/>
+                <w:bCs/>
+                <w:color w:val="auto"/>
               </w:rPr>
             </w:pPr>
             <w:r>
               <w:rPr>
                 <w:b/>
                 <w:bCs/>
-                <w:color w:val="000000" w:themeColor="text1"/>
+                <w:color w:val="auto"/>
                 <w:sz w:val="19"/>
                 <w:szCs w:val="19"/>
               </w:rPr>
@@ -300,7 +302,7 @@
               <w:rPr>
                 <w:b/>
                 <w:bCs/>
-                <w:color w:val="000000" w:themeColor="text1"/>
+                <w:color w:val="auto"/>
                 <w:sz w:val="19"/>
                 <w:szCs w:val="19"/>
               </w:rPr>
@@ -329,7 +331,9 @@
           <w:p>
             <w:pPr>
               <w:rPr>
-                <w:color w:val="000000" w:themeColor="text1"/>
+                <w:b/>
+                <w:bCs/>
+                <w:color w:val="auto"/>
               </w:rPr>
             </w:pPr>
             <w:proofErr w:type="spellStart"/>
@@ -337,7 +341,7 @@
               <w:rPr>
                 <w:b/>
                 <w:bCs/>
-                <w:color w:val="000000" w:themeColor="text1"/>
+                <w:color w:val="auto"/>
                 <w:sz w:val="19"/>
                 <w:szCs w:val="19"/>
               </w:rPr>
@@ -348,41 +352,11 @@
               <w:rPr>
                 <w:b/>
                 <w:bCs/>
-                <w:color w:val="000000" w:themeColor="text1"/>
-                <w:sz w:val="19"/>
-                <w:szCs w:val="19"/>
-              </w:rPr>
-              <w:t xml:space="preserve"> </w:t>
-            </w:r>
-            <w:r>
-              <w:rPr>
-                <w:b/>
-                <w:bCs/>
-                <w:color w:val="000000" w:themeColor="text1"/>
-                <w:sz w:val="19"/>
-                <w:szCs w:val="19"/>
-              </w:rPr>
-              <w:t>25</w:t>
-            </w:r>
-            <w:r>
-              <w:rPr>
-                <w:b/>
-                <w:bCs/>
-                <w:color w:val="000000" w:themeColor="text1"/>
-                <w:sz w:val="19"/>
-                <w:szCs w:val="19"/>
-              </w:rPr>
-              <w:t>0</w:t>
-            </w:r>
-            <w:r>
-              <w:rPr>
-                <w:b/>
-                <w:bCs/>
-                <w:color w:val="000000" w:themeColor="text1"/>
-                <w:sz w:val="19"/>
-                <w:szCs w:val="19"/>
-              </w:rPr>
-              <w:t>,000</w:t>
+                <w:color w:val="auto"/>
+                <w:sz w:val="19"/>
+                <w:szCs w:val="19"/>
+              </w:rPr>
+              <w:t xml:space="preserve"> 350,000</w:t>
             </w:r>
           </w:p>
         </w:tc>
@@ -407,16 +381,16 @@
           <w:p>
             <w:pPr>
               <w:rPr>
-                <w:color w:val="000000" w:themeColor="text1"/>
+                <w:color w:val="auto"/>
               </w:rPr>
             </w:pPr>
             <w:r>
               <w:rPr>
-                <w:color w:val="000000" w:themeColor="text1"/>
-                <w:sz w:val="19"/>
-                <w:szCs w:val="19"/>
-              </w:rPr>
-              <w:t>One-time per site. Includes deployment, configuration, monitoring, inverter control, analytics, alarms, audit trail, forecasting/export, and initial onboarding.</w:t>
+                <w:color w:val="auto"/>
+                <w:sz w:val="19"/>
+                <w:szCs w:val="19"/>
+              </w:rPr>
+              <w:t>Includes deployment, configuration, monitoring, inverter control, plant output auto capping, analytics, alarms, audit trail, ML forecasting, Solcast toolkit (free), export, cloud backup, operator messaging, and initial onboarding.</w:t>
             </w:r>
           </w:p>
         </w:tc>
@@ -446,12 +420,16 @@
           <w:p>
             <w:pPr>
               <w:rPr>
-                <w:color w:val="000000" w:themeColor="text1"/>
+                <w:b/>
+                <w:bCs/>
+                <w:color w:val="auto"/>
               </w:rPr>
             </w:pPr>
             <w:r>
               <w:rPr>
-                <w:color w:val="000000" w:themeColor="text1"/>
+                <w:b/>
+                <w:bCs/>
+                <w:color w:val="auto"/>
                 <w:sz w:val="19"/>
                 <w:szCs w:val="19"/>
               </w:rPr>
@@ -480,7 +458,9 @@
           <w:p>
             <w:pPr>
               <w:rPr>
-                <w:color w:val="000000" w:themeColor="text1"/>
+                <w:b/>
+                <w:bCs/>
+                <w:color w:val="auto"/>
               </w:rPr>
             </w:pPr>
             <w:proofErr w:type="spellStart"/>
@@ -488,7 +468,7 @@
               <w:rPr>
                 <w:b/>
                 <w:bCs/>
-                <w:color w:val="000000" w:themeColor="text1"/>
+                <w:color w:val="auto"/>
                 <w:sz w:val="19"/>
                 <w:szCs w:val="19"/>
               </w:rPr>
@@ -499,41 +479,11 @@
               <w:rPr>
                 <w:b/>
                 <w:bCs/>
-                <w:color w:val="000000" w:themeColor="text1"/>
-                <w:sz w:val="19"/>
-                <w:szCs w:val="19"/>
-              </w:rPr>
-              <w:t xml:space="preserve"> </w:t>
-            </w:r>
-            <w:r>
-              <w:rPr>
-                <w:b/>
-                <w:bCs/>
-                <w:color w:val="000000" w:themeColor="text1"/>
-                <w:sz w:val="19"/>
-                <w:szCs w:val="19"/>
-              </w:rPr>
-              <w:t>35</w:t>
-            </w:r>
-            <w:r>
-              <w:rPr>
-                <w:b/>
-                <w:bCs/>
-                <w:color w:val="000000" w:themeColor="text1"/>
-                <w:sz w:val="19"/>
-                <w:szCs w:val="19"/>
-              </w:rPr>
-              <w:t>,000 / mo</w:t>
-            </w:r>
-            <w:r>
-              <w:rPr>
-                <w:b/>
-                <w:bCs/>
-                <w:color w:val="000000" w:themeColor="text1"/>
-                <w:sz w:val="19"/>
-                <w:szCs w:val="19"/>
-              </w:rPr>
-              <w:t>.</w:t>
+                <w:color w:val="auto"/>
+                <w:sz w:val="19"/>
+                <w:szCs w:val="19"/>
+              </w:rPr>
+              <w:t xml:space="preserve"> 45,000 / mo.</w:t>
             </w:r>
           </w:p>
         </w:tc>
@@ -558,16 +508,16 @@
           <w:p>
             <w:pPr>
               <w:rPr>
-                <w:color w:val="000000" w:themeColor="text1"/>
+                <w:color w:val="auto"/>
               </w:rPr>
             </w:pPr>
             <w:r>
               <w:rPr>
-                <w:color w:val="000000" w:themeColor="text1"/>
-                <w:sz w:val="19"/>
-                <w:szCs w:val="19"/>
-              </w:rPr>
-              <w:t>Software updates, bug fixes, remote support, and standard maintenance.</w:t>
+                <w:color w:val="auto"/>
+                <w:sz w:val="19"/>
+                <w:szCs w:val="19"/>
+              </w:rPr>
+              <w:t>Software updates, bug fixes, remote support, feature enhancements, and standard maintenance.</w:t>
             </w:r>
           </w:p>
         </w:tc>
@@ -594,12 +544,16 @@
           <w:p>
             <w:pPr>
               <w:rPr>
-                <w:color w:val="000000" w:themeColor="text1"/>
+                <w:b/>
+                <w:bCs/>
+                <w:color w:val="auto"/>
               </w:rPr>
             </w:pPr>
             <w:r>
               <w:rPr>
-                <w:color w:val="000000" w:themeColor="text1"/>
+                <w:b/>
+                <w:bCs/>
+                <w:color w:val="auto"/>
                 <w:sz w:val="19"/>
                 <w:szCs w:val="19"/>
               </w:rPr>
@@ -628,7 +582,9 @@
           <w:p>
             <w:pPr>
               <w:rPr>
-                <w:color w:val="000000" w:themeColor="text1"/>
+                <w:b/>
+                <w:bCs/>
+                <w:color w:val="auto"/>
               </w:rPr>
             </w:pPr>
             <w:proofErr w:type="spellStart"/>
@@ -636,7 +592,7 @@
               <w:rPr>
                 <w:b/>
                 <w:bCs/>
-                <w:color w:val="000000" w:themeColor="text1"/>
+                <w:color w:val="auto"/>
                 <w:sz w:val="19"/>
                 <w:szCs w:val="19"/>
               </w:rPr>
@@ -647,81 +603,11 @@
               <w:rPr>
                 <w:b/>
                 <w:bCs/>
-                <w:color w:val="000000" w:themeColor="text1"/>
-                <w:sz w:val="19"/>
-                <w:szCs w:val="19"/>
-              </w:rPr>
-              <w:t xml:space="preserve"> </w:t>
-            </w:r>
-            <w:r>
-              <w:rPr>
-                <w:b/>
-                <w:bCs/>
-                <w:color w:val="000000" w:themeColor="text1"/>
-                <w:sz w:val="19"/>
-                <w:szCs w:val="19"/>
-              </w:rPr>
-              <w:t>400</w:t>
-            </w:r>
-            <w:r>
-              <w:rPr>
-                <w:b/>
-                <w:bCs/>
-                <w:color w:val="000000" w:themeColor="text1"/>
-                <w:sz w:val="19"/>
-                <w:szCs w:val="19"/>
-              </w:rPr>
-              <w:t>,00</w:t>
-            </w:r>
-            <w:r>
-              <w:rPr>
-                <w:b/>
-                <w:bCs/>
-                <w:color w:val="000000" w:themeColor="text1"/>
-                <w:sz w:val="19"/>
-                <w:szCs w:val="19"/>
-              </w:rPr>
-              <w:t xml:space="preserve">0 </w:t>
-            </w:r>
-            <w:r>
-              <w:rPr>
-                <w:b/>
-                <w:bCs/>
-                <w:color w:val="000000" w:themeColor="text1"/>
-                <w:sz w:val="19"/>
-                <w:szCs w:val="19"/>
-              </w:rPr>
-              <w:t>/</w:t>
-            </w:r>
-            <w:r>
-              <w:rPr>
-                <w:b/>
-                <w:bCs/>
-                <w:color w:val="000000" w:themeColor="text1"/>
-                <w:sz w:val="19"/>
-                <w:szCs w:val="19"/>
-              </w:rPr>
-              <w:t xml:space="preserve"> </w:t>
-            </w:r>
-            <w:r>
-              <w:rPr>
-                <w:b/>
-                <w:bCs/>
-                <w:color w:val="000000" w:themeColor="text1"/>
-                <w:sz w:val="19"/>
-                <w:szCs w:val="19"/>
-              </w:rPr>
-              <w:t>yr</w:t>
-            </w:r>
-            <w:r>
-              <w:rPr>
-                <w:b/>
-                <w:bCs/>
-                <w:color w:val="000000" w:themeColor="text1"/>
-                <w:sz w:val="19"/>
-                <w:szCs w:val="19"/>
-              </w:rPr>
-              <w:t>.</w:t>
+                <w:color w:val="auto"/>
+                <w:sz w:val="19"/>
+                <w:szCs w:val="19"/>
+              </w:rPr>
+              <w:t xml:space="preserve"> 500,000 / yr.</w:t>
             </w:r>
           </w:p>
         </w:tc>
@@ -746,12 +632,12 @@
           <w:p>
             <w:pPr>
               <w:rPr>
-                <w:color w:val="000000" w:themeColor="text1"/>
+                <w:color w:val="auto"/>
               </w:rPr>
             </w:pPr>
             <w:r>
               <w:rPr>
-                <w:color w:val="000000" w:themeColor="text1"/>
+                <w:color w:val="auto"/>
                 <w:sz w:val="19"/>
                 <w:szCs w:val="19"/>
               </w:rPr>
@@ -785,14 +671,16 @@
           <w:p>
             <w:pPr>
               <w:rPr>
-                <w:color w:val="000000" w:themeColor="text1"/>
+                <w:b/>
+                <w:bCs/>
+                <w:color w:val="auto"/>
               </w:rPr>
             </w:pPr>
             <w:r>
               <w:rPr>
                 <w:b/>
                 <w:bCs/>
-                <w:color w:val="000000" w:themeColor="text1"/>
+                <w:color w:val="auto"/>
                 <w:sz w:val="19"/>
                 <w:szCs w:val="19"/>
               </w:rPr>
@@ -821,7 +709,9 @@
           <w:p>
             <w:pPr>
               <w:rPr>
-                <w:color w:val="000000" w:themeColor="text1"/>
+                <w:b/>
+                <w:bCs/>
+                <w:color w:val="auto"/>
               </w:rPr>
             </w:pPr>
             <w:proofErr w:type="spellStart"/>
@@ -829,7 +719,7 @@
               <w:rPr>
                 <w:b/>
                 <w:bCs/>
-                <w:color w:val="000000" w:themeColor="text1"/>
+                <w:color w:val="auto"/>
                 <w:sz w:val="19"/>
                 <w:szCs w:val="19"/>
               </w:rPr>
@@ -840,41 +730,11 @@
               <w:rPr>
                 <w:b/>
                 <w:bCs/>
-                <w:color w:val="000000" w:themeColor="text1"/>
-                <w:sz w:val="19"/>
-                <w:szCs w:val="19"/>
-              </w:rPr>
-              <w:t xml:space="preserve"> </w:t>
-            </w:r>
-            <w:r>
-              <w:rPr>
-                <w:b/>
-                <w:bCs/>
-                <w:color w:val="000000" w:themeColor="text1"/>
-                <w:sz w:val="19"/>
-                <w:szCs w:val="19"/>
-              </w:rPr>
-              <w:t>20</w:t>
-            </w:r>
-            <w:r>
-              <w:rPr>
-                <w:b/>
-                <w:bCs/>
-                <w:color w:val="000000" w:themeColor="text1"/>
-                <w:sz w:val="19"/>
-                <w:szCs w:val="19"/>
-              </w:rPr>
-              <w:t>,000 / y</w:t>
-            </w:r>
-            <w:r>
-              <w:rPr>
-                <w:b/>
-                <w:bCs/>
-                <w:color w:val="000000" w:themeColor="text1"/>
-                <w:sz w:val="19"/>
-                <w:szCs w:val="19"/>
-              </w:rPr>
-              <w:t>r.</w:t>
+                <w:color w:val="auto"/>
+                <w:sz w:val="19"/>
+                <w:szCs w:val="19"/>
+              </w:rPr>
+              <w:t xml:space="preserve"> 40,000 / yr.</w:t>
             </w:r>
           </w:p>
         </w:tc>
@@ -899,14 +759,14 @@
           <w:p>
             <w:pPr>
               <w:rPr>
-                <w:color w:val="000000" w:themeColor="text1"/>
+                <w:color w:val="auto"/>
               </w:rPr>
             </w:pPr>
             <w:r>
               <w:rPr>
                 <w:i/>
                 <w:iCs/>
-                <w:color w:val="000000" w:themeColor="text1"/>
+                <w:color w:val="auto"/>
                 <w:sz w:val="18"/>
                 <w:szCs w:val="18"/>
               </w:rPr>
@@ -940,12 +800,12 @@
           <w:p>
             <w:pPr>
               <w:rPr>
-                <w:color w:val="000000" w:themeColor="text1"/>
+                <w:color w:val="auto"/>
               </w:rPr>
             </w:pPr>
             <w:r>
               <w:rPr>
-                <w:color w:val="000000" w:themeColor="text1"/>
+                <w:color w:val="auto"/>
                 <w:sz w:val="19"/>
                 <w:szCs w:val="19"/>
               </w:rPr>
@@ -974,12 +834,12 @@
           <w:p>
             <w:pPr>
               <w:rPr>
-                <w:color w:val="000000" w:themeColor="text1"/>
+                <w:color w:val="auto"/>
               </w:rPr>
             </w:pPr>
             <w:r>
               <w:rPr>
-                <w:color w:val="000000" w:themeColor="text1"/>
+                <w:color w:val="auto"/>
                 <w:sz w:val="19"/>
                 <w:szCs w:val="19"/>
               </w:rPr>
@@ -1008,26 +868,38 @@
           <w:p>
             <w:pPr>
               <w:rPr>
-                <w:color w:val="000000" w:themeColor="text1"/>
+                <w:color w:val="auto"/>
               </w:rPr>
             </w:pPr>
             <w:r>
               <w:rPr>
-                <w:color w:val="000000" w:themeColor="text1"/>
-                <w:sz w:val="19"/>
-                <w:szCs w:val="19"/>
-              </w:rPr>
-              <w:t>On-site support, customization, additional remote clients, integrations, and future enhancements.</w:t>
+                <w:color w:val="auto"/>
+                <w:sz w:val="19"/>
+                <w:szCs w:val="19"/>
+              </w:rPr>
+              <w:t>Customization, additional</w:t>
+            </w:r>
+            <w:r>
+              <w:rPr>
+                <w:color w:val="auto"/>
+                <w:sz w:val="19"/>
+                <w:szCs w:val="19"/>
+              </w:rPr>
+              <w:t xml:space="preserve"> </w:t>
+            </w:r>
+            <w:r>
+              <w:rPr>
+                <w:color w:val="auto"/>
+                <w:sz w:val="19"/>
+                <w:szCs w:val="19"/>
+              </w:rPr>
+              <w:t>functions/features, and future enhancements.</w:t>
             </w:r>
           </w:p>
         </w:tc>
       </w:tr>
     </w:tbl>
-    <w:p>
-      <w:pPr>
-        <w:spacing w:before="400"/>
-      </w:pPr>
-    </w:p>
+    <w:p/>
     <w:p>
       <w:pPr>
         <w:pStyle w:val="Heading1"/>
@@ -1048,6 +920,10 @@
           <w:bottom w:val="single" w:sz="8" w:space="1" w:color="2563AB"/>
         </w:pBdr>
         <w:spacing w:before="60" w:after="200"/>
+        <w:rPr>
+          <w:sz w:val="2"/>
+          <w:szCs w:val="2"/>
+        </w:rPr>
       </w:pPr>
     </w:p>
     <w:tbl>
@@ -1160,16 +1036,16 @@
           <w:p>
             <w:pPr>
               <w:rPr>
-                <w:color w:val="000000" w:themeColor="text1"/>
+                <w:color w:val="auto"/>
               </w:rPr>
             </w:pPr>
             <w:r>
               <w:rPr>
-                <w:color w:val="000000" w:themeColor="text1"/>
-                <w:sz w:val="19"/>
-                <w:szCs w:val="19"/>
-              </w:rPr>
-              <w:t>Custom reports, export formats, or integration changes</w:t>
+                <w:color w:val="auto"/>
+                <w:sz w:val="19"/>
+                <w:szCs w:val="19"/>
+              </w:rPr>
+              <w:t>Customization, and additional functions/features</w:t>
             </w:r>
           </w:p>
         </w:tc>
@@ -1194,7 +1070,7 @@
           <w:p>
             <w:pPr>
               <w:rPr>
-                <w:color w:val="000000" w:themeColor="text1"/>
+                <w:color w:val="auto"/>
               </w:rPr>
             </w:pPr>
             <w:proofErr w:type="spellStart"/>
@@ -1202,7 +1078,7 @@
               <w:rPr>
                 <w:b/>
                 <w:bCs/>
-                <w:color w:val="000000" w:themeColor="text1"/>
+                <w:color w:val="auto"/>
                 <w:sz w:val="19"/>
                 <w:szCs w:val="19"/>
               </w:rPr>
@@ -1213,71 +1089,11 @@
               <w:rPr>
                 <w:b/>
                 <w:bCs/>
-                <w:color w:val="000000" w:themeColor="text1"/>
-                <w:sz w:val="19"/>
-                <w:szCs w:val="19"/>
-              </w:rPr>
-              <w:t xml:space="preserve"> </w:t>
-            </w:r>
-            <w:r>
-              <w:rPr>
-                <w:b/>
-                <w:bCs/>
-                <w:color w:val="000000" w:themeColor="text1"/>
-                <w:sz w:val="19"/>
-                <w:szCs w:val="19"/>
-              </w:rPr>
-              <w:t>1</w:t>
-            </w:r>
-            <w:r>
-              <w:rPr>
-                <w:b/>
-                <w:bCs/>
-                <w:color w:val="000000" w:themeColor="text1"/>
-                <w:sz w:val="19"/>
-                <w:szCs w:val="19"/>
-              </w:rPr>
-              <w:t>0</w:t>
-            </w:r>
-            <w:r>
-              <w:rPr>
-                <w:b/>
-                <w:bCs/>
-                <w:color w:val="000000" w:themeColor="text1"/>
-                <w:sz w:val="19"/>
-                <w:szCs w:val="19"/>
-              </w:rPr>
-              <w:t xml:space="preserve">,000 – </w:t>
-            </w:r>
-            <w:r>
-              <w:rPr>
-                <w:b/>
-                <w:bCs/>
-                <w:color w:val="000000" w:themeColor="text1"/>
-                <w:sz w:val="19"/>
-                <w:szCs w:val="19"/>
-              </w:rPr>
-              <w:t>3</w:t>
-            </w:r>
-            <w:r>
-              <w:rPr>
-                <w:b/>
-                <w:bCs/>
-                <w:color w:val="000000" w:themeColor="text1"/>
-                <w:sz w:val="19"/>
-                <w:szCs w:val="19"/>
-              </w:rPr>
-              <w:t>0</w:t>
-            </w:r>
-            <w:r>
-              <w:rPr>
-                <w:b/>
-                <w:bCs/>
-                <w:color w:val="000000" w:themeColor="text1"/>
-                <w:sz w:val="19"/>
-                <w:szCs w:val="19"/>
-              </w:rPr>
-              <w:t>,000</w:t>
+                <w:color w:val="auto"/>
+                <w:sz w:val="19"/>
+                <w:szCs w:val="19"/>
+              </w:rPr>
+              <w:t xml:space="preserve"> 15,000 - 50,000</w:t>
             </w:r>
           </w:p>
         </w:tc>
@@ -1307,12 +1123,12 @@
           <w:p>
             <w:pPr>
               <w:rPr>
-                <w:color w:val="000000" w:themeColor="text1"/>
+                <w:color w:val="auto"/>
               </w:rPr>
             </w:pPr>
             <w:r>
               <w:rPr>
-                <w:color w:val="000000" w:themeColor="text1"/>
+                <w:color w:val="auto"/>
                 <w:sz w:val="19"/>
                 <w:szCs w:val="19"/>
               </w:rPr>
@@ -1341,14 +1157,14 @@
           <w:p>
             <w:pPr>
               <w:rPr>
-                <w:color w:val="000000" w:themeColor="text1"/>
+                <w:color w:val="auto"/>
               </w:rPr>
             </w:pPr>
             <w:r>
               <w:rPr>
                 <w:b/>
                 <w:bCs/>
-                <w:color w:val="000000" w:themeColor="text1"/>
+                <w:color w:val="auto"/>
                 <w:sz w:val="19"/>
                 <w:szCs w:val="19"/>
               </w:rPr>
@@ -1359,7 +1175,7 @@
               <w:rPr>
                 <w:b/>
                 <w:bCs/>
-                <w:color w:val="000000" w:themeColor="text1"/>
+                <w:color w:val="auto"/>
                 <w:sz w:val="19"/>
                 <w:szCs w:val="19"/>
               </w:rPr>
@@ -1370,31 +1186,11 @@
               <w:rPr>
                 <w:b/>
                 <w:bCs/>
-                <w:color w:val="000000" w:themeColor="text1"/>
-                <w:sz w:val="19"/>
-                <w:szCs w:val="19"/>
-              </w:rPr>
-              <w:t xml:space="preserve"> </w:t>
-            </w:r>
-            <w:r>
-              <w:rPr>
-                <w:b/>
-                <w:bCs/>
-                <w:color w:val="000000" w:themeColor="text1"/>
-                <w:sz w:val="19"/>
-                <w:szCs w:val="19"/>
-              </w:rPr>
-              <w:t>12</w:t>
-            </w:r>
-            <w:r>
-              <w:rPr>
-                <w:b/>
-                <w:bCs/>
-                <w:color w:val="000000" w:themeColor="text1"/>
-                <w:sz w:val="19"/>
-                <w:szCs w:val="19"/>
-              </w:rPr>
-              <w:t>0,000</w:t>
+                <w:color w:val="auto"/>
+                <w:sz w:val="19"/>
+                <w:szCs w:val="19"/>
+              </w:rPr>
+              <w:t xml:space="preserve"> 150,000</w:t>
             </w:r>
           </w:p>
         </w:tc>
@@ -1404,12 +1200,155 @@
       <w:pPr>
         <w:pStyle w:val="ListParagraph"/>
         <w:spacing w:before="60" w:after="60"/>
+      </w:pPr>
+    </w:p>
+    <w:p>
+      <w:pPr>
+        <w:pStyle w:val="ListParagraph"/>
+        <w:spacing w:before="60" w:after="60"/>
+      </w:pPr>
+    </w:p>
+    <w:p>
+      <w:pPr>
+        <w:pStyle w:val="ListParagraph"/>
+        <w:spacing w:before="60" w:after="60"/>
         <w:ind w:left="480"/>
       </w:pPr>
     </w:p>
+    <w:p>
+      <w:pPr>
+        <w:pStyle w:val="ListParagraph"/>
+        <w:spacing w:before="60" w:after="60"/>
+        <w:ind w:left="567" w:hanging="567"/>
+        <w:rPr>
+          <w:color w:val="auto"/>
+        </w:rPr>
+      </w:pPr>
+      <w:r>
+        <w:rPr>
+          <w:noProof/>
+          <w:color w:val="auto"/>
+        </w:rPr>
+        <w:drawing>
+          <wp:anchor distT="0" distB="0" distL="114300" distR="114300" simplePos="0" relativeHeight="251658240" behindDoc="0" locked="0" layoutInCell="1" allowOverlap="1" wp14:anchorId="5E4E7048" wp14:editId="59F53DAC">
+            <wp:simplePos x="0" y="0"/>
+            <wp:positionH relativeFrom="column">
+              <wp:posOffset>1151890</wp:posOffset>
+            </wp:positionH>
+            <wp:positionV relativeFrom="paragraph">
+              <wp:posOffset>144145</wp:posOffset>
+            </wp:positionV>
+            <wp:extent cx="718450" cy="664463"/>
+            <wp:effectExtent l="0" t="0" r="5715" b="2540"/>
+            <wp:wrapNone/>
+            <wp:docPr id="951574134" name="Picture 1"/>
+            <wp:cNvGraphicFramePr>
+              <a:graphicFrameLocks xmlns:a="http://schemas.openxmlformats.org/drawingml/2006/main" noChangeAspect="1"/>
+            </wp:cNvGraphicFramePr>
+            <a:graphic xmlns:a="http://schemas.openxmlformats.org/drawingml/2006/main">
+              <a:graphicData uri="http://schemas.openxmlformats.org/drawingml/2006/picture">
+                <pic:pic xmlns:pic="http://schemas.openxmlformats.org/drawingml/2006/picture">
+                  <pic:nvPicPr>
+                    <pic:cNvPr id="951574134" name="Picture 951574134"/>
+                    <pic:cNvPicPr/>
+                  </pic:nvPicPr>
+                  <pic:blipFill>
+                    <a:blip r:embed="rId7" cstate="print">
+                      <a:extLst>
+                        <a:ext uri="{28A0092B-C50C-407E-A947-70E740481C1C}">
+                          <a14:useLocalDpi xmlns:a14="http://schemas.microsoft.com/office/drawing/2010/main" val="0"/>
+                        </a:ext>
+                      </a:extLst>
+                    </a:blip>
+                    <a:stretch>
+                      <a:fillRect/>
+                    </a:stretch>
+                  </pic:blipFill>
+                  <pic:spPr>
+                    <a:xfrm>
+                      <a:off x="0" y="0"/>
+                      <a:ext cx="718450" cy="664463"/>
+                    </a:xfrm>
+                    <a:prstGeom prst="rect">
+                      <a:avLst/>
+                    </a:prstGeom>
+                  </pic:spPr>
+                </pic:pic>
+              </a:graphicData>
+            </a:graphic>
+            <wp14:sizeRelH relativeFrom="page">
+              <wp14:pctWidth>0</wp14:pctWidth>
+            </wp14:sizeRelH>
+            <wp14:sizeRelV relativeFrom="page">
+              <wp14:pctHeight>0</wp14:pctHeight>
+            </wp14:sizeRelV>
+          </wp:anchor>
+        </w:drawing>
+      </w:r>
+      <w:r>
+        <w:rPr>
+          <w:color w:val="auto"/>
+        </w:rPr>
+        <w:t>Prepared by:</w:t>
+      </w:r>
+      <w:r>
+        <w:rPr>
+          <w:color w:val="auto"/>
+        </w:rPr>
+        <w:br/>
+      </w:r>
+      <w:r>
+        <w:rPr>
+          <w:color w:val="auto"/>
+        </w:rPr>
+        <w:br/>
+      </w:r>
+      <w:r>
+        <w:rPr>
+          <w:color w:val="auto"/>
+        </w:rPr>
+        <w:tab/>
+      </w:r>
+      <w:r>
+        <w:rPr>
+          <w:color w:val="auto"/>
+        </w:rPr>
+        <w:br/>
+      </w:r>
+      <w:r>
+        <w:rPr>
+          <w:b/>
+          <w:bCs/>
+          <w:color w:val="auto"/>
+        </w:rPr>
+        <w:t>ENGR. CLARIDEN D. MONTAÑO, REE</w:t>
+      </w:r>
+      <w:r>
+        <w:rPr>
+          <w:color w:val="auto"/>
+        </w:rPr>
+        <w:br/>
+      </w:r>
+      <w:r>
+        <w:rPr>
+          <w:i/>
+          <w:iCs/>
+          <w:color w:val="auto"/>
+        </w:rPr>
+        <w:t>Software</w:t>
+      </w:r>
+      <w:r>
+        <w:rPr>
+          <w:i/>
+          <w:iCs/>
+          <w:color w:val="auto"/>
+        </w:rPr>
+        <w:t xml:space="preserve"> Developer</w:t>
+      </w:r>
+    </w:p>
     <w:sectPr>
-      <w:headerReference w:type="default" r:id="rId7"/>
-      <w:footerReference w:type="default" r:id="rId8"/>
+      <w:headerReference w:type="default" r:id="rId8"/>
+      <w:footerReference w:type="default" r:id="rId9"/>
       <w:pgSz w:w="11906" w:h="16838" w:code="9"/>
       <w:pgMar w:top="1080" w:right="1260" w:bottom="1080" w:left="1260" w:header="708" w:footer="708" w:gutter="0"/>
       <w:cols w:space="720"/>

</xml_diff>